<commit_message>
FastAPI Phase 2: Production (7 topics) - FastAPI complete, 14/14
Routers/structure, middleware+CORS, OAuth2+JWT, SQLAlchemy sessions,
BackgroundTasks vs Celery, TestClient, docs + deployment

Co-Authored-By: Claude Fable 5 <noreply@anthropic.com>
Claude-Session: https://claude.ai/code/session_01Vm8nqoCZNTvUn3BNmW1Tgz
</commit_message>
<xml_diff>
--- a/FastAPI_Interview_Theory.docx
+++ b/FastAPI_Interview_Theory.docx
@@ -2420,6 +2420,2229 @@
           <w:szCs w:val="18"/>
         </w:rPr>
         <w:t xml:space="preserve">HTTPException covers direct cases, validation errors return structured 422s for free, and custom exception handlers map domain exceptions to HTTP responses centrally - so business code raises OrderNotFound and only the handler layer speaks HTTP. Unexpected errors stay generic 500s with details going to logging, never to the client.</w:t>
+      </w:r>
+    </w:p>
+    <w:p>
+      <w:pPr>
+        <w:spacing w:before="200" w:after="60" w:line="230" w:lineRule="auto"/>
+      </w:pPr>
+      <w:r>
+        <w:rPr>
+          <w:b/>
+          <w:color w:val="1F4E79"/>
+          <w:sz w:val="26"/>
+          <w:szCs w:val="26"/>
+        </w:rPr>
+        <w:t xml:space="preserve">FastAPI Phase 2 - Production</w:t>
+      </w:r>
+    </w:p>
+    <w:p>
+      <w:pPr>
+        <w:spacing w:before="140" w:after="40" w:line="230" w:lineRule="auto"/>
+      </w:pPr>
+      <w:r>
+        <w:rPr>
+          <w:b/>
+          <w:sz w:val="21"/>
+          <w:szCs w:val="21"/>
+        </w:rPr>
+        <w:t xml:space="preserve">F2.1  Routers and Project Structure</w:t>
+      </w:r>
+    </w:p>
+    <w:p>
+      <w:pPr>
+        <w:spacing w:before="0" w:after="40" w:line="230" w:lineRule="auto"/>
+      </w:pPr>
+      <w:r>
+        <w:rPr>
+          <w:b/>
+          <w:sz w:val="18"/>
+          <w:szCs w:val="18"/>
+        </w:rPr>
+        <w:t xml:space="preserve">What it is:  </w:t>
+      </w:r>
+      <w:r>
+        <w:rPr>
+          <w:sz w:val="18"/>
+          <w:szCs w:val="18"/>
+        </w:rPr>
+        <w:t xml:space="preserve">APIRouter splits endpoints into modules per feature; the app include_router()s them - FastAPI's version of Django apps.</w:t>
+      </w:r>
+    </w:p>
+    <w:p>
+      <w:pPr>
+        <w:ind w:left="260" w:hanging="200"/>
+        <w:spacing w:before="0" w:after="25" w:line="230" w:lineRule="auto"/>
+      </w:pPr>
+      <w:r>
+        <w:rPr>
+          <w:sz w:val="18"/>
+          <w:szCs w:val="18"/>
+        </w:rPr>
+        <w:t xml:space="preserve">•   </w:t>
+      </w:r>
+      <w:r>
+        <w:rPr>
+          <w:sz w:val="18"/>
+          <w:szCs w:val="18"/>
+        </w:rPr>
+        <w:t xml:space="preserve">APIRouter(prefix="/orders", tags=["orders"]) - endpoints defined on the router; tags group them in Swagger.</w:t>
+      </w:r>
+    </w:p>
+    <w:p>
+      <w:pPr>
+        <w:ind w:left="260" w:hanging="200"/>
+        <w:spacing w:before="0" w:after="25" w:line="230" w:lineRule="auto"/>
+      </w:pPr>
+      <w:r>
+        <w:rPr>
+          <w:sz w:val="18"/>
+          <w:szCs w:val="18"/>
+        </w:rPr>
+        <w:t xml:space="preserve">•   </w:t>
+      </w:r>
+      <w:r>
+        <w:rPr>
+          <w:sz w:val="18"/>
+          <w:szCs w:val="18"/>
+        </w:rPr>
+        <w:t xml:space="preserve">app.include_router(orders.router) mounts it; a global /api/v1 prefix at include time gives versioning.</w:t>
+      </w:r>
+    </w:p>
+    <w:p>
+      <w:pPr>
+        <w:ind w:left="260" w:hanging="200"/>
+        <w:spacing w:before="0" w:after="25" w:line="230" w:lineRule="auto"/>
+      </w:pPr>
+      <w:r>
+        <w:rPr>
+          <w:sz w:val="18"/>
+          <w:szCs w:val="18"/>
+        </w:rPr>
+        <w:t xml:space="preserve">•   </w:t>
+      </w:r>
+      <w:r>
+        <w:rPr>
+          <w:sz w:val="18"/>
+          <w:szCs w:val="18"/>
+        </w:rPr>
+        <w:t xml:space="preserve">Typical layout: app/main.py (app + includes), routers/ (endpoints), schemas/ (Pydantic), models/ (SQLAlchemy), services/ (business logic), dependencies.py, core/config.py.</w:t>
+      </w:r>
+    </w:p>
+    <w:p>
+      <w:pPr>
+        <w:ind w:left="260" w:hanging="200"/>
+        <w:spacing w:before="0" w:after="25" w:line="230" w:lineRule="auto"/>
+      </w:pPr>
+      <w:r>
+        <w:rPr>
+          <w:sz w:val="18"/>
+          <w:szCs w:val="18"/>
+        </w:rPr>
+        <w:t xml:space="preserve">•   </w:t>
+      </w:r>
+      <w:r>
+        <w:rPr>
+          <w:sz w:val="18"/>
+          <w:szCs w:val="18"/>
+        </w:rPr>
+        <w:t xml:space="preserve">Keep endpoints thin: parse -&gt; call service -&gt; shape response. Business logic lives in services, testable without HTTP.</w:t>
+      </w:r>
+    </w:p>
+    <w:p>
+      <w:pPr>
+        <w:ind w:left="260" w:hanging="200"/>
+        <w:spacing w:before="0" w:after="25" w:line="230" w:lineRule="auto"/>
+      </w:pPr>
+      <w:r>
+        <w:rPr>
+          <w:sz w:val="18"/>
+          <w:szCs w:val="18"/>
+        </w:rPr>
+        <w:t xml:space="preserve">•   </w:t>
+      </w:r>
+      <w:r>
+        <w:rPr>
+          <w:sz w:val="18"/>
+          <w:szCs w:val="18"/>
+        </w:rPr>
+        <w:t xml:space="preserve">Router-level dependencies apply auth to a whole feature: APIRouter(dependencies=[Depends(admin_only)]).</w:t>
+      </w:r>
+    </w:p>
+    <w:p>
+      <w:pPr>
+        <w:ind w:left="260" w:hanging="200"/>
+        <w:spacing w:before="0" w:after="25" w:line="230" w:lineRule="auto"/>
+      </w:pPr>
+      <w:r>
+        <w:rPr>
+          <w:sz w:val="18"/>
+          <w:szCs w:val="18"/>
+        </w:rPr>
+        <w:t xml:space="preserve">•   </w:t>
+      </w:r>
+      <w:r>
+        <w:rPr>
+          <w:sz w:val="18"/>
+          <w:szCs w:val="18"/>
+        </w:rPr>
+        <w:t xml:space="preserve">Settings via pydantic-settings BaseSettings - env vars parsed and validated like any model.</w:t>
+      </w:r>
+    </w:p>
+    <w:p>
+      <w:pPr>
+        <w:ind w:left="260" w:hanging="0"/>
+        <w:spacing w:before="0" w:after="15" w:line="230" w:lineRule="auto"/>
+        <w:shd w:val="clear" w:color="auto" w:fill="F2F2F2"/>
+      </w:pPr>
+      <w:r>
+        <w:rPr>
+          <w:b/>
+          <w:sz w:val="17"/>
+          <w:szCs w:val="17"/>
+        </w:rPr>
+        <w:t xml:space="preserve">Example:  </w:t>
+      </w:r>
+      <w:r>
+        <w:rPr>
+          <w:rFonts w:ascii="Consolas" w:hAnsi="Consolas" w:cs="Consolas"/>
+          <w:color w:val="3B3B3B"/>
+          <w:sz w:val="17"/>
+          <w:szCs w:val="17"/>
+        </w:rPr>
+        <w:t xml:space="preserve"># routers/orders.py</w:t>
+      </w:r>
+    </w:p>
+    <w:p>
+      <w:pPr>
+        <w:ind w:left="260" w:hanging="0"/>
+        <w:spacing w:before="0" w:after="15" w:line="230" w:lineRule="auto"/>
+        <w:shd w:val="clear" w:color="auto" w:fill="F2F2F2"/>
+      </w:pPr>
+      <w:r>
+        <w:rPr>
+          <w:rFonts w:ascii="Consolas" w:hAnsi="Consolas" w:cs="Consolas"/>
+          <w:color w:val="3B3B3B"/>
+          <w:sz w:val="17"/>
+          <w:szCs w:val="17"/>
+        </w:rPr>
+        <w:t xml:space="preserve">router = APIRouter(prefix="/orders",</w:t>
+      </w:r>
+    </w:p>
+    <w:p>
+      <w:pPr>
+        <w:ind w:left="260" w:hanging="0"/>
+        <w:spacing w:before="0" w:after="15" w:line="230" w:lineRule="auto"/>
+        <w:shd w:val="clear" w:color="auto" w:fill="F2F2F2"/>
+      </w:pPr>
+      <w:r>
+        <w:rPr>
+          <w:rFonts w:ascii="Consolas" w:hAnsi="Consolas" w:cs="Consolas"/>
+          <w:color w:val="3B3B3B"/>
+          <w:sz w:val="17"/>
+          <w:szCs w:val="17"/>
+        </w:rPr>
+        <w:t xml:space="preserve">                   tags=["orders"])</w:t>
+      </w:r>
+    </w:p>
+    <w:p>
+      <w:pPr>
+        <w:ind w:left="260" w:hanging="0"/>
+        <w:spacing w:before="0" w:after="15" w:line="230" w:lineRule="auto"/>
+        <w:shd w:val="clear" w:color="auto" w:fill="F2F2F2"/>
+      </w:pPr>
+      <w:r>
+        <w:rPr>
+          <w:rFonts w:ascii="Consolas" w:hAnsi="Consolas" w:cs="Consolas"/>
+          <w:color w:val="3B3B3B"/>
+          <w:sz w:val="17"/>
+          <w:szCs w:val="17"/>
+        </w:rPr>
+        <w:t xml:space="preserve">@router.get("/")</w:t>
+      </w:r>
+    </w:p>
+    <w:p>
+      <w:pPr>
+        <w:ind w:left="260" w:hanging="0"/>
+        <w:spacing w:before="0" w:after="15" w:line="230" w:lineRule="auto"/>
+        <w:shd w:val="clear" w:color="auto" w:fill="F2F2F2"/>
+      </w:pPr>
+      <w:r>
+        <w:rPr>
+          <w:rFonts w:ascii="Consolas" w:hAnsi="Consolas" w:cs="Consolas"/>
+          <w:color w:val="3B3B3B"/>
+          <w:sz w:val="17"/>
+          <w:szCs w:val="17"/>
+        </w:rPr>
+        <w:t xml:space="preserve">async def list_orders(...): ...</w:t>
+      </w:r>
+    </w:p>
+    <w:p>
+      <w:pPr>
+        <w:ind w:left="260" w:hanging="0"/>
+        <w:spacing w:before="0" w:after="15" w:line="230" w:lineRule="auto"/>
+        <w:shd w:val="clear" w:color="auto" w:fill="F2F2F2"/>
+      </w:pPr>
+      <w:r>
+        <w:rPr>
+          <w:rFonts w:ascii="Consolas" w:hAnsi="Consolas" w:cs="Consolas"/>
+          <w:color w:val="3B3B3B"/>
+          <w:sz w:val="17"/>
+          <w:szCs w:val="17"/>
+        </w:rPr>
+        <w:t xml:space="preserve"># main.py</w:t>
+      </w:r>
+    </w:p>
+    <w:p>
+      <w:pPr>
+        <w:ind w:left="260" w:hanging="0"/>
+        <w:spacing w:before="0" w:after="15" w:line="230" w:lineRule="auto"/>
+        <w:shd w:val="clear" w:color="auto" w:fill="F2F2F2"/>
+      </w:pPr>
+      <w:r>
+        <w:rPr>
+          <w:rFonts w:ascii="Consolas" w:hAnsi="Consolas" w:cs="Consolas"/>
+          <w:color w:val="3B3B3B"/>
+          <w:sz w:val="17"/>
+          <w:szCs w:val="17"/>
+        </w:rPr>
+        <w:t xml:space="preserve">app.include_router(orders.router,</w:t>
+      </w:r>
+    </w:p>
+    <w:p>
+      <w:pPr>
+        <w:ind w:left="260" w:hanging="0"/>
+        <w:spacing w:before="0" w:after="15" w:line="230" w:lineRule="auto"/>
+        <w:shd w:val="clear" w:color="auto" w:fill="F2F2F2"/>
+      </w:pPr>
+      <w:r>
+        <w:rPr>
+          <w:rFonts w:ascii="Consolas" w:hAnsi="Consolas" w:cs="Consolas"/>
+          <w:color w:val="3B3B3B"/>
+          <w:sz w:val="17"/>
+          <w:szCs w:val="17"/>
+        </w:rPr>
+        <w:t xml:space="preserve">                   prefix="/api/v1")</w:t>
+      </w:r>
+    </w:p>
+    <w:p>
+      <w:pPr>
+        <w:ind w:left="120" w:hanging="0"/>
+        <w:spacing w:before="50" w:after="110" w:line="230" w:lineRule="auto"/>
+        <w:pBdr>
+          <w:left w:val="single" w:sz="12" w:space="4" w:color="2E5E1F"/>
+        </w:pBdr>
+      </w:pPr>
+      <w:r>
+        <w:rPr>
+          <w:b/>
+          <w:color w:val="2E5E1F"/>
+          <w:sz w:val="18"/>
+          <w:szCs w:val="18"/>
+        </w:rPr>
+        <w:t xml:space="preserve">Interview answer:  </w:t>
+      </w:r>
+      <w:r>
+        <w:rPr>
+          <w:i/>
+          <w:sz w:val="18"/>
+          <w:szCs w:val="18"/>
+        </w:rPr>
+        <w:t xml:space="preserve">APIRouter modularizes endpoints per feature with shared prefixes, tags and router-level auth dependencies, mounted via include_router with an /api/v1 prefix for versioning. I keep endpoints thin over a services layer, schemas and models in their own modules, and configuration in a validated pydantic-settings class.</w:t>
+      </w:r>
+    </w:p>
+    <w:p>
+      <w:pPr>
+        <w:spacing w:before="140" w:after="40" w:line="230" w:lineRule="auto"/>
+      </w:pPr>
+      <w:r>
+        <w:rPr>
+          <w:b/>
+          <w:sz w:val="21"/>
+          <w:szCs w:val="21"/>
+        </w:rPr>
+        <w:t xml:space="preserve">F2.2  Middleware and CORS</w:t>
+      </w:r>
+    </w:p>
+    <w:p>
+      <w:pPr>
+        <w:spacing w:before="0" w:after="40" w:line="230" w:lineRule="auto"/>
+      </w:pPr>
+      <w:r>
+        <w:rPr>
+          <w:b/>
+          <w:sz w:val="18"/>
+          <w:szCs w:val="18"/>
+        </w:rPr>
+        <w:t xml:space="preserve">What it is:  </w:t>
+      </w:r>
+      <w:r>
+        <w:rPr>
+          <w:sz w:val="18"/>
+          <w:szCs w:val="18"/>
+        </w:rPr>
+        <w:t xml:space="preserve">Middleware wraps every request/response; CORSMiddleware is the one every SPA-backed API must configure.</w:t>
+      </w:r>
+    </w:p>
+    <w:p>
+      <w:pPr>
+        <w:ind w:left="260" w:hanging="200"/>
+        <w:spacing w:before="0" w:after="25" w:line="230" w:lineRule="auto"/>
+      </w:pPr>
+      <w:r>
+        <w:rPr>
+          <w:sz w:val="18"/>
+          <w:szCs w:val="18"/>
+        </w:rPr>
+        <w:t xml:space="preserve">•   </w:t>
+      </w:r>
+      <w:r>
+        <w:rPr>
+          <w:sz w:val="18"/>
+          <w:szCs w:val="18"/>
+        </w:rPr>
+        <w:t xml:space="preserve">@app.middleware("http") or add_middleware() - code before call_next sees the request, after it the response (timing, request-id, logging).</w:t>
+      </w:r>
+    </w:p>
+    <w:p>
+      <w:pPr>
+        <w:ind w:left="260" w:hanging="200"/>
+        <w:spacing w:before="0" w:after="25" w:line="230" w:lineRule="auto"/>
+      </w:pPr>
+      <w:r>
+        <w:rPr>
+          <w:sz w:val="18"/>
+          <w:szCs w:val="18"/>
+        </w:rPr>
+        <w:t xml:space="preserve">•   </w:t>
+      </w:r>
+      <w:r>
+        <w:rPr>
+          <w:sz w:val="18"/>
+          <w:szCs w:val="18"/>
+        </w:rPr>
+        <w:t xml:space="preserve">CORS: browsers block cross-origin JS calls unless the server sends Access-Control-* headers; preflight OPTIONS requests come first for non-simple requests.</w:t>
+      </w:r>
+    </w:p>
+    <w:p>
+      <w:pPr>
+        <w:ind w:left="260" w:hanging="200"/>
+        <w:spacing w:before="0" w:after="25" w:line="230" w:lineRule="auto"/>
+      </w:pPr>
+      <w:r>
+        <w:rPr>
+          <w:sz w:val="18"/>
+          <w:szCs w:val="18"/>
+        </w:rPr>
+        <w:t xml:space="preserve">•   </w:t>
+      </w:r>
+      <w:r>
+        <w:rPr>
+          <w:sz w:val="18"/>
+          <w:szCs w:val="18"/>
+        </w:rPr>
+        <w:t xml:space="preserve">CORSMiddleware(allow_origins=[...], allow_methods, allow_headers, allow_credentials) - the fix for "works in Postman, fails in browser".</w:t>
+      </w:r>
+    </w:p>
+    <w:p>
+      <w:pPr>
+        <w:ind w:left="260" w:hanging="200"/>
+        <w:spacing w:before="0" w:after="25" w:line="230" w:lineRule="auto"/>
+      </w:pPr>
+      <w:r>
+        <w:rPr>
+          <w:sz w:val="18"/>
+          <w:szCs w:val="18"/>
+        </w:rPr>
+        <w:t xml:space="preserve">•   </w:t>
+      </w:r>
+      <w:r>
+        <w:rPr>
+          <w:sz w:val="18"/>
+          <w:szCs w:val="18"/>
+        </w:rPr>
+        <w:t xml:space="preserve">allow_origins=["*"] cannot combine with allow_credentials=True - browsers reject it; list real origins in production.</w:t>
+      </w:r>
+    </w:p>
+    <w:p>
+      <w:pPr>
+        <w:ind w:left="260" w:hanging="200"/>
+        <w:spacing w:before="0" w:after="25" w:line="230" w:lineRule="auto"/>
+      </w:pPr>
+      <w:r>
+        <w:rPr>
+          <w:sz w:val="18"/>
+          <w:szCs w:val="18"/>
+        </w:rPr>
+        <w:t xml:space="preserve">•   </w:t>
+      </w:r>
+      <w:r>
+        <w:rPr>
+          <w:sz w:val="18"/>
+          <w:szCs w:val="18"/>
+        </w:rPr>
+        <w:t xml:space="preserve">Order matters here too - CORS middleware must sit early enough to decorate even error responses.</w:t>
+      </w:r>
+    </w:p>
+    <w:p>
+      <w:pPr>
+        <w:ind w:left="260" w:hanging="200"/>
+        <w:spacing w:before="0" w:after="25" w:line="230" w:lineRule="auto"/>
+      </w:pPr>
+      <w:r>
+        <w:rPr>
+          <w:sz w:val="18"/>
+          <w:szCs w:val="18"/>
+        </w:rPr>
+        <w:t xml:space="preserve">•   </w:t>
+      </w:r>
+      <w:r>
+        <w:rPr>
+          <w:sz w:val="18"/>
+          <w:szCs w:val="18"/>
+        </w:rPr>
+        <w:t xml:space="preserve">Heavier concerns (rate limiting, auth at the edge) often live in the gateway/nginx rather than app middleware.</w:t>
+      </w:r>
+    </w:p>
+    <w:p>
+      <w:pPr>
+        <w:ind w:left="260" w:hanging="0"/>
+        <w:spacing w:before="0" w:after="15" w:line="230" w:lineRule="auto"/>
+        <w:shd w:val="clear" w:color="auto" w:fill="F2F2F2"/>
+      </w:pPr>
+      <w:r>
+        <w:rPr>
+          <w:b/>
+          <w:sz w:val="17"/>
+          <w:szCs w:val="17"/>
+        </w:rPr>
+        <w:t xml:space="preserve">Example:  </w:t>
+      </w:r>
+      <w:r>
+        <w:rPr>
+          <w:rFonts w:ascii="Consolas" w:hAnsi="Consolas" w:cs="Consolas"/>
+          <w:color w:val="3B3B3B"/>
+          <w:sz w:val="17"/>
+          <w:szCs w:val="17"/>
+        </w:rPr>
+        <w:t xml:space="preserve">app.add_middleware(</w:t>
+      </w:r>
+    </w:p>
+    <w:p>
+      <w:pPr>
+        <w:ind w:left="260" w:hanging="0"/>
+        <w:spacing w:before="0" w:after="15" w:line="230" w:lineRule="auto"/>
+        <w:shd w:val="clear" w:color="auto" w:fill="F2F2F2"/>
+      </w:pPr>
+      <w:r>
+        <w:rPr>
+          <w:rFonts w:ascii="Consolas" w:hAnsi="Consolas" w:cs="Consolas"/>
+          <w:color w:val="3B3B3B"/>
+          <w:sz w:val="17"/>
+          <w:szCs w:val="17"/>
+        </w:rPr>
+        <w:t xml:space="preserve">    CORSMiddleware,</w:t>
+      </w:r>
+    </w:p>
+    <w:p>
+      <w:pPr>
+        <w:ind w:left="260" w:hanging="0"/>
+        <w:spacing w:before="0" w:after="15" w:line="230" w:lineRule="auto"/>
+        <w:shd w:val="clear" w:color="auto" w:fill="F2F2F2"/>
+      </w:pPr>
+      <w:r>
+        <w:rPr>
+          <w:rFonts w:ascii="Consolas" w:hAnsi="Consolas" w:cs="Consolas"/>
+          <w:color w:val="3B3B3B"/>
+          <w:sz w:val="17"/>
+          <w:szCs w:val="17"/>
+        </w:rPr>
+        <w:t xml:space="preserve">    allow_origins=["https://shop.example.com"],</w:t>
+      </w:r>
+    </w:p>
+    <w:p>
+      <w:pPr>
+        <w:ind w:left="260" w:hanging="0"/>
+        <w:spacing w:before="0" w:after="15" w:line="230" w:lineRule="auto"/>
+        <w:shd w:val="clear" w:color="auto" w:fill="F2F2F2"/>
+      </w:pPr>
+      <w:r>
+        <w:rPr>
+          <w:rFonts w:ascii="Consolas" w:hAnsi="Consolas" w:cs="Consolas"/>
+          <w:color w:val="3B3B3B"/>
+          <w:sz w:val="17"/>
+          <w:szCs w:val="17"/>
+        </w:rPr>
+        <w:t xml:space="preserve">    allow_credentials=True,</w:t>
+      </w:r>
+    </w:p>
+    <w:p>
+      <w:pPr>
+        <w:ind w:left="260" w:hanging="0"/>
+        <w:spacing w:before="0" w:after="15" w:line="230" w:lineRule="auto"/>
+        <w:shd w:val="clear" w:color="auto" w:fill="F2F2F2"/>
+      </w:pPr>
+      <w:r>
+        <w:rPr>
+          <w:rFonts w:ascii="Consolas" w:hAnsi="Consolas" w:cs="Consolas"/>
+          <w:color w:val="3B3B3B"/>
+          <w:sz w:val="17"/>
+          <w:szCs w:val="17"/>
+        </w:rPr>
+        <w:t xml:space="preserve">    allow_methods=["*"],</w:t>
+      </w:r>
+    </w:p>
+    <w:p>
+      <w:pPr>
+        <w:ind w:left="260" w:hanging="0"/>
+        <w:spacing w:before="0" w:after="15" w:line="230" w:lineRule="auto"/>
+        <w:shd w:val="clear" w:color="auto" w:fill="F2F2F2"/>
+      </w:pPr>
+      <w:r>
+        <w:rPr>
+          <w:rFonts w:ascii="Consolas" w:hAnsi="Consolas" w:cs="Consolas"/>
+          <w:color w:val="3B3B3B"/>
+          <w:sz w:val="17"/>
+          <w:szCs w:val="17"/>
+        </w:rPr>
+        <w:t xml:space="preserve">    allow_headers=["*"],</w:t>
+      </w:r>
+    </w:p>
+    <w:p>
+      <w:pPr>
+        <w:ind w:left="260" w:hanging="0"/>
+        <w:spacing w:before="0" w:after="15" w:line="230" w:lineRule="auto"/>
+        <w:shd w:val="clear" w:color="auto" w:fill="F2F2F2"/>
+      </w:pPr>
+      <w:r>
+        <w:rPr>
+          <w:rFonts w:ascii="Consolas" w:hAnsi="Consolas" w:cs="Consolas"/>
+          <w:color w:val="3B3B3B"/>
+          <w:sz w:val="17"/>
+          <w:szCs w:val="17"/>
+        </w:rPr>
+        <w:t xml:space="preserve">)</w:t>
+      </w:r>
+    </w:p>
+    <w:p>
+      <w:pPr>
+        <w:ind w:left="120" w:hanging="0"/>
+        <w:spacing w:before="50" w:after="110" w:line="230" w:lineRule="auto"/>
+        <w:pBdr>
+          <w:left w:val="single" w:sz="12" w:space="4" w:color="2E5E1F"/>
+        </w:pBdr>
+      </w:pPr>
+      <w:r>
+        <w:rPr>
+          <w:b/>
+          <w:color w:val="2E5E1F"/>
+          <w:sz w:val="18"/>
+          <w:szCs w:val="18"/>
+        </w:rPr>
+        <w:t xml:space="preserve">Interview answer:  </w:t>
+      </w:r>
+      <w:r>
+        <w:rPr>
+          <w:i/>
+          <w:sz w:val="18"/>
+          <w:szCs w:val="18"/>
+        </w:rPr>
+        <w:t xml:space="preserve">Middleware wraps all requests for cross-cutting work like timing and request IDs. CORS is the browser's cross-origin gate - CORSMiddleware answers preflights and sets the allow headers; wildcard origins don't combine with credentials, so production lists exact origins. It is the standard fix for APIs that work in Postman but fail from the React app.</w:t>
+      </w:r>
+    </w:p>
+    <w:p>
+      <w:pPr>
+        <w:spacing w:before="140" w:after="40" w:line="230" w:lineRule="auto"/>
+      </w:pPr>
+      <w:r>
+        <w:rPr>
+          <w:b/>
+          <w:sz w:val="21"/>
+          <w:szCs w:val="21"/>
+        </w:rPr>
+        <w:t xml:space="preserve">F2.3  Authentication - OAuth2 Password Flow + JWT</w:t>
+      </w:r>
+    </w:p>
+    <w:p>
+      <w:pPr>
+        <w:spacing w:before="0" w:after="40" w:line="230" w:lineRule="auto"/>
+      </w:pPr>
+      <w:r>
+        <w:rPr>
+          <w:b/>
+          <w:sz w:val="18"/>
+          <w:szCs w:val="18"/>
+        </w:rPr>
+        <w:t xml:space="preserve">What it is:  </w:t>
+      </w:r>
+      <w:r>
+        <w:rPr>
+          <w:sz w:val="18"/>
+          <w:szCs w:val="18"/>
+        </w:rPr>
+        <w:t xml:space="preserve">The standard FastAPI auth: a /token endpoint checks credentials and issues a JWT; a dependency validates the Bearer token on every protected route.</w:t>
+      </w:r>
+    </w:p>
+    <w:p>
+      <w:pPr>
+        <w:ind w:left="260" w:hanging="200"/>
+        <w:spacing w:before="0" w:after="25" w:line="230" w:lineRule="auto"/>
+      </w:pPr>
+      <w:r>
+        <w:rPr>
+          <w:sz w:val="18"/>
+          <w:szCs w:val="18"/>
+        </w:rPr>
+        <w:t xml:space="preserve">•   </w:t>
+      </w:r>
+      <w:r>
+        <w:rPr>
+          <w:sz w:val="18"/>
+          <w:szCs w:val="18"/>
+        </w:rPr>
+        <w:t xml:space="preserve">OAuth2PasswordBearer(tokenUrl="token") extracts the Authorization: Bearer header and powers the Swagger login button.</w:t>
+      </w:r>
+    </w:p>
+    <w:p>
+      <w:pPr>
+        <w:ind w:left="260" w:hanging="200"/>
+        <w:spacing w:before="0" w:after="25" w:line="230" w:lineRule="auto"/>
+      </w:pPr>
+      <w:r>
+        <w:rPr>
+          <w:sz w:val="18"/>
+          <w:szCs w:val="18"/>
+        </w:rPr>
+        <w:t xml:space="preserve">•   </w:t>
+      </w:r>
+      <w:r>
+        <w:rPr>
+          <w:sz w:val="18"/>
+          <w:szCs w:val="18"/>
+        </w:rPr>
+        <w:t xml:space="preserve">/token endpoint: verify password (passlib/bcrypt hashes - never plain), then jwt.encode({"sub": username, "exp": ...}, SECRET, "HS256").</w:t>
+      </w:r>
+    </w:p>
+    <w:p>
+      <w:pPr>
+        <w:ind w:left="260" w:hanging="200"/>
+        <w:spacing w:before="0" w:after="25" w:line="230" w:lineRule="auto"/>
+      </w:pPr>
+      <w:r>
+        <w:rPr>
+          <w:sz w:val="18"/>
+          <w:szCs w:val="18"/>
+        </w:rPr>
+        <w:t xml:space="preserve">•   </w:t>
+      </w:r>
+      <w:r>
+        <w:rPr>
+          <w:sz w:val="18"/>
+          <w:szCs w:val="18"/>
+        </w:rPr>
+        <w:t xml:space="preserve">get_current_user dependency: decode + verify signature and expiry, load the user, raise 401 with WWW-Authenticate on failure.</w:t>
+      </w:r>
+    </w:p>
+    <w:p>
+      <w:pPr>
+        <w:ind w:left="260" w:hanging="200"/>
+        <w:spacing w:before="0" w:after="25" w:line="230" w:lineRule="auto"/>
+      </w:pPr>
+      <w:r>
+        <w:rPr>
+          <w:sz w:val="18"/>
+          <w:szCs w:val="18"/>
+        </w:rPr>
+        <w:t xml:space="preserve">•   </w:t>
+      </w:r>
+      <w:r>
+        <w:rPr>
+          <w:sz w:val="18"/>
+          <w:szCs w:val="18"/>
+        </w:rPr>
+        <w:t xml:space="preserve">Protected endpoints just declare user: User = Depends(get_current_user) - auth is a dependency, not a middleware, so per-route control is natural.</w:t>
+      </w:r>
+    </w:p>
+    <w:p>
+      <w:pPr>
+        <w:ind w:left="260" w:hanging="200"/>
+        <w:spacing w:before="0" w:after="25" w:line="230" w:lineRule="auto"/>
+      </w:pPr>
+      <w:r>
+        <w:rPr>
+          <w:sz w:val="18"/>
+          <w:szCs w:val="18"/>
+        </w:rPr>
+        <w:t xml:space="preserve">•   </w:t>
+      </w:r>
+      <w:r>
+        <w:rPr>
+          <w:sz w:val="18"/>
+          <w:szCs w:val="18"/>
+        </w:rPr>
+        <w:t xml:space="preserve">Same JWT trade-offs as Django notes: short expiry + refresh, revocation needs state, claims are readable - HTTPS always.</w:t>
+      </w:r>
+    </w:p>
+    <w:p>
+      <w:pPr>
+        <w:ind w:left="260" w:hanging="200"/>
+        <w:spacing w:before="0" w:after="25" w:line="230" w:lineRule="auto"/>
+      </w:pPr>
+      <w:r>
+        <w:rPr>
+          <w:sz w:val="18"/>
+          <w:szCs w:val="18"/>
+        </w:rPr>
+        <w:t xml:space="preserve">•   </w:t>
+      </w:r>
+      <w:r>
+        <w:rPr>
+          <w:sz w:val="18"/>
+          <w:szCs w:val="18"/>
+        </w:rPr>
+        <w:t xml:space="preserve">Role checks nest: require_admin depends on get_current_user and raises 403 - then routers include it wholesale.</w:t>
+      </w:r>
+    </w:p>
+    <w:p>
+      <w:pPr>
+        <w:ind w:left="260" w:hanging="0"/>
+        <w:spacing w:before="0" w:after="15" w:line="230" w:lineRule="auto"/>
+        <w:shd w:val="clear" w:color="auto" w:fill="F2F2F2"/>
+      </w:pPr>
+      <w:r>
+        <w:rPr>
+          <w:b/>
+          <w:sz w:val="17"/>
+          <w:szCs w:val="17"/>
+        </w:rPr>
+        <w:t xml:space="preserve">Example:  </w:t>
+      </w:r>
+      <w:r>
+        <w:rPr>
+          <w:rFonts w:ascii="Consolas" w:hAnsi="Consolas" w:cs="Consolas"/>
+          <w:color w:val="3B3B3B"/>
+          <w:sz w:val="17"/>
+          <w:szCs w:val="17"/>
+        </w:rPr>
+        <w:t xml:space="preserve">oauth2 = OAuth2PasswordBearer(tokenUrl="token")</w:t>
+      </w:r>
+    </w:p>
+    <w:p>
+      <w:pPr>
+        <w:ind w:left="260" w:hanging="0"/>
+        <w:spacing w:before="0" w:after="15" w:line="230" w:lineRule="auto"/>
+        <w:shd w:val="clear" w:color="auto" w:fill="F2F2F2"/>
+      </w:pPr>
+      <w:r>
+        <w:rPr>
+          <w:rFonts w:ascii="Consolas" w:hAnsi="Consolas" w:cs="Consolas"/>
+          <w:color w:val="3B3B3B"/>
+          <w:sz w:val="17"/>
+          <w:szCs w:val="17"/>
+        </w:rPr>
+        <w:t xml:space="preserve"/>
+      </w:r>
+    </w:p>
+    <w:p>
+      <w:pPr>
+        <w:ind w:left="260" w:hanging="0"/>
+        <w:spacing w:before="0" w:after="15" w:line="230" w:lineRule="auto"/>
+        <w:shd w:val="clear" w:color="auto" w:fill="F2F2F2"/>
+      </w:pPr>
+      <w:r>
+        <w:rPr>
+          <w:rFonts w:ascii="Consolas" w:hAnsi="Consolas" w:cs="Consolas"/>
+          <w:color w:val="3B3B3B"/>
+          <w:sz w:val="17"/>
+          <w:szCs w:val="17"/>
+        </w:rPr>
+        <w:t xml:space="preserve">async def get_current_user(</w:t>
+      </w:r>
+    </w:p>
+    <w:p>
+      <w:pPr>
+        <w:ind w:left="260" w:hanging="0"/>
+        <w:spacing w:before="0" w:after="15" w:line="230" w:lineRule="auto"/>
+        <w:shd w:val="clear" w:color="auto" w:fill="F2F2F2"/>
+      </w:pPr>
+      <w:r>
+        <w:rPr>
+          <w:rFonts w:ascii="Consolas" w:hAnsi="Consolas" w:cs="Consolas"/>
+          <w:color w:val="3B3B3B"/>
+          <w:sz w:val="17"/>
+          <w:szCs w:val="17"/>
+        </w:rPr>
+        <w:t xml:space="preserve">        token: str = Depends(oauth2)):</w:t>
+      </w:r>
+    </w:p>
+    <w:p>
+      <w:pPr>
+        <w:ind w:left="260" w:hanging="0"/>
+        <w:spacing w:before="0" w:after="15" w:line="230" w:lineRule="auto"/>
+        <w:shd w:val="clear" w:color="auto" w:fill="F2F2F2"/>
+      </w:pPr>
+      <w:r>
+        <w:rPr>
+          <w:rFonts w:ascii="Consolas" w:hAnsi="Consolas" w:cs="Consolas"/>
+          <w:color w:val="3B3B3B"/>
+          <w:sz w:val="17"/>
+          <w:szCs w:val="17"/>
+        </w:rPr>
+        <w:t xml:space="preserve">    try:</w:t>
+      </w:r>
+    </w:p>
+    <w:p>
+      <w:pPr>
+        <w:ind w:left="260" w:hanging="0"/>
+        <w:spacing w:before="0" w:after="15" w:line="230" w:lineRule="auto"/>
+        <w:shd w:val="clear" w:color="auto" w:fill="F2F2F2"/>
+      </w:pPr>
+      <w:r>
+        <w:rPr>
+          <w:rFonts w:ascii="Consolas" w:hAnsi="Consolas" w:cs="Consolas"/>
+          <w:color w:val="3B3B3B"/>
+          <w:sz w:val="17"/>
+          <w:szCs w:val="17"/>
+        </w:rPr>
+        <w:t xml:space="preserve">        payload = jwt.decode(token, SECRET,</w:t>
+      </w:r>
+    </w:p>
+    <w:p>
+      <w:pPr>
+        <w:ind w:left="260" w:hanging="0"/>
+        <w:spacing w:before="0" w:after="15" w:line="230" w:lineRule="auto"/>
+        <w:shd w:val="clear" w:color="auto" w:fill="F2F2F2"/>
+      </w:pPr>
+      <w:r>
+        <w:rPr>
+          <w:rFonts w:ascii="Consolas" w:hAnsi="Consolas" w:cs="Consolas"/>
+          <w:color w:val="3B3B3B"/>
+          <w:sz w:val="17"/>
+          <w:szCs w:val="17"/>
+        </w:rPr>
+        <w:t xml:space="preserve">                             algorithms=["HS256"])</w:t>
+      </w:r>
+    </w:p>
+    <w:p>
+      <w:pPr>
+        <w:ind w:left="260" w:hanging="0"/>
+        <w:spacing w:before="0" w:after="15" w:line="230" w:lineRule="auto"/>
+        <w:shd w:val="clear" w:color="auto" w:fill="F2F2F2"/>
+      </w:pPr>
+      <w:r>
+        <w:rPr>
+          <w:rFonts w:ascii="Consolas" w:hAnsi="Consolas" w:cs="Consolas"/>
+          <w:color w:val="3B3B3B"/>
+          <w:sz w:val="17"/>
+          <w:szCs w:val="17"/>
+        </w:rPr>
+        <w:t xml:space="preserve">    except JWTError:</w:t>
+      </w:r>
+    </w:p>
+    <w:p>
+      <w:pPr>
+        <w:ind w:left="260" w:hanging="0"/>
+        <w:spacing w:before="0" w:after="15" w:line="230" w:lineRule="auto"/>
+        <w:shd w:val="clear" w:color="auto" w:fill="F2F2F2"/>
+      </w:pPr>
+      <w:r>
+        <w:rPr>
+          <w:rFonts w:ascii="Consolas" w:hAnsi="Consolas" w:cs="Consolas"/>
+          <w:color w:val="3B3B3B"/>
+          <w:sz w:val="17"/>
+          <w:szCs w:val="17"/>
+        </w:rPr>
+        <w:t xml:space="preserve">        raise HTTPException(401)</w:t>
+      </w:r>
+    </w:p>
+    <w:p>
+      <w:pPr>
+        <w:ind w:left="260" w:hanging="0"/>
+        <w:spacing w:before="0" w:after="15" w:line="230" w:lineRule="auto"/>
+        <w:shd w:val="clear" w:color="auto" w:fill="F2F2F2"/>
+      </w:pPr>
+      <w:r>
+        <w:rPr>
+          <w:rFonts w:ascii="Consolas" w:hAnsi="Consolas" w:cs="Consolas"/>
+          <w:color w:val="3B3B3B"/>
+          <w:sz w:val="17"/>
+          <w:szCs w:val="17"/>
+        </w:rPr>
+        <w:t xml:space="preserve">    return await load_user(payload["sub"])</w:t>
+      </w:r>
+    </w:p>
+    <w:p>
+      <w:pPr>
+        <w:ind w:left="120" w:hanging="0"/>
+        <w:spacing w:before="50" w:after="110" w:line="230" w:lineRule="auto"/>
+        <w:pBdr>
+          <w:left w:val="single" w:sz="12" w:space="4" w:color="2E5E1F"/>
+        </w:pBdr>
+      </w:pPr>
+      <w:r>
+        <w:rPr>
+          <w:b/>
+          <w:color w:val="2E5E1F"/>
+          <w:sz w:val="18"/>
+          <w:szCs w:val="18"/>
+        </w:rPr>
+        <w:t xml:space="preserve">Interview answer:  </w:t>
+      </w:r>
+      <w:r>
+        <w:rPr>
+          <w:i/>
+          <w:sz w:val="18"/>
+          <w:szCs w:val="18"/>
+        </w:rPr>
+        <w:t xml:space="preserve">The pattern is OAuth2 password flow: /token verifies bcrypt-hashed credentials and returns a signed JWT with sub and exp; OAuth2PasswordBearer pulls the Bearer token and a get_current_user dependency decodes, verifies and loads the user, raising 401 on failure. Role checks are just nested dependencies, and the usual JWT caveats - short expiry, refresh, revocation statefulness - apply.</w:t>
+      </w:r>
+    </w:p>
+    <w:p>
+      <w:pPr>
+        <w:spacing w:before="140" w:after="40" w:line="230" w:lineRule="auto"/>
+      </w:pPr>
+      <w:r>
+        <w:rPr>
+          <w:b/>
+          <w:sz w:val="21"/>
+          <w:szCs w:val="21"/>
+        </w:rPr>
+        <w:t xml:space="preserve">F2.4  Database - SQLAlchemy Session Pattern</w:t>
+      </w:r>
+    </w:p>
+    <w:p>
+      <w:pPr>
+        <w:spacing w:before="0" w:after="40" w:line="230" w:lineRule="auto"/>
+      </w:pPr>
+      <w:r>
+        <w:rPr>
+          <w:b/>
+          <w:sz w:val="18"/>
+          <w:szCs w:val="18"/>
+        </w:rPr>
+        <w:t xml:space="preserve">What it is:  </w:t>
+      </w:r>
+      <w:r>
+        <w:rPr>
+          <w:sz w:val="18"/>
+          <w:szCs w:val="18"/>
+        </w:rPr>
+        <w:t xml:space="preserve">FastAPI has no ORM; the standard stack is SQLAlchemy + Alembic migrations, with a session-per-request dependency.</w:t>
+      </w:r>
+    </w:p>
+    <w:p>
+      <w:pPr>
+        <w:ind w:left="260" w:hanging="200"/>
+        <w:spacing w:before="0" w:after="25" w:line="230" w:lineRule="auto"/>
+      </w:pPr>
+      <w:r>
+        <w:rPr>
+          <w:sz w:val="18"/>
+          <w:szCs w:val="18"/>
+        </w:rPr>
+        <w:t xml:space="preserve">•   </w:t>
+      </w:r>
+      <w:r>
+        <w:rPr>
+          <w:sz w:val="18"/>
+          <w:szCs w:val="18"/>
+        </w:rPr>
+        <w:t xml:space="preserve">SQLAlchemy: engine (pool) -&gt; SessionLocal factory -&gt; per-request session from a yield dependency that always closes it.</w:t>
+      </w:r>
+    </w:p>
+    <w:p>
+      <w:pPr>
+        <w:ind w:left="260" w:hanging="200"/>
+        <w:spacing w:before="0" w:after="25" w:line="230" w:lineRule="auto"/>
+      </w:pPr>
+      <w:r>
+        <w:rPr>
+          <w:sz w:val="18"/>
+          <w:szCs w:val="18"/>
+        </w:rPr>
+        <w:t xml:space="preserve">•   </w:t>
+      </w:r>
+      <w:r>
+        <w:rPr>
+          <w:sz w:val="18"/>
+          <w:szCs w:val="18"/>
+        </w:rPr>
+        <w:t xml:space="preserve">Endpoints/services receive db: Session = Depends(get_db) - the FastAPI equivalent of Django's request-scoped DB handling.</w:t>
+      </w:r>
+    </w:p>
+    <w:p>
+      <w:pPr>
+        <w:ind w:left="260" w:hanging="200"/>
+        <w:spacing w:before="0" w:after="25" w:line="230" w:lineRule="auto"/>
+      </w:pPr>
+      <w:r>
+        <w:rPr>
+          <w:sz w:val="18"/>
+          <w:szCs w:val="18"/>
+        </w:rPr>
+        <w:t xml:space="preserve">•   </w:t>
+      </w:r>
+      <w:r>
+        <w:rPr>
+          <w:sz w:val="18"/>
+          <w:szCs w:val="18"/>
+        </w:rPr>
+        <w:t xml:space="preserve">Alembic = makemigrations/migrate equivalent: autogenerate diffs, upgrade head applies - versioned in git the same way.</w:t>
+      </w:r>
+    </w:p>
+    <w:p>
+      <w:pPr>
+        <w:ind w:left="260" w:hanging="200"/>
+        <w:spacing w:before="0" w:after="25" w:line="230" w:lineRule="auto"/>
+      </w:pPr>
+      <w:r>
+        <w:rPr>
+          <w:sz w:val="18"/>
+          <w:szCs w:val="18"/>
+        </w:rPr>
+        <w:t xml:space="preserve">•   </w:t>
+      </w:r>
+      <w:r>
+        <w:rPr>
+          <w:sz w:val="18"/>
+          <w:szCs w:val="18"/>
+        </w:rPr>
+        <w:t xml:space="preserve">Pydantic from_attributes (ORM mode) converts SQLAlchemy objects to response models.</w:t>
+      </w:r>
+    </w:p>
+    <w:p>
+      <w:pPr>
+        <w:ind w:left="260" w:hanging="200"/>
+        <w:spacing w:before="0" w:after="25" w:line="230" w:lineRule="auto"/>
+      </w:pPr>
+      <w:r>
+        <w:rPr>
+          <w:sz w:val="18"/>
+          <w:szCs w:val="18"/>
+        </w:rPr>
+        <w:t xml:space="preserve">•   </w:t>
+      </w:r>
+      <w:r>
+        <w:rPr>
+          <w:sz w:val="18"/>
+          <w:szCs w:val="18"/>
+        </w:rPr>
+        <w:t xml:space="preserve">Fully async option: create_async_engine + AsyncSession + await db.execute(select(...)) - pairs with asyncpg; sync psycopg2 sessions in async def endpoints are the classic blocking bug again.</w:t>
+      </w:r>
+    </w:p>
+    <w:p>
+      <w:pPr>
+        <w:ind w:left="260" w:hanging="200"/>
+        <w:spacing w:before="0" w:after="25" w:line="230" w:lineRule="auto"/>
+      </w:pPr>
+      <w:r>
+        <w:rPr>
+          <w:sz w:val="18"/>
+          <w:szCs w:val="18"/>
+        </w:rPr>
+        <w:t xml:space="preserve">•   </w:t>
+      </w:r>
+      <w:r>
+        <w:rPr>
+          <w:sz w:val="18"/>
+          <w:szCs w:val="18"/>
+        </w:rPr>
+        <w:t xml:space="preserve">The 2.0-style select() API replaces legacy query() - worth naming in interviews.</w:t>
+      </w:r>
+    </w:p>
+    <w:p>
+      <w:pPr>
+        <w:ind w:left="260" w:hanging="200"/>
+        <w:spacing w:before="0" w:after="25" w:line="230" w:lineRule="auto"/>
+      </w:pPr>
+      <w:r>
+        <w:rPr>
+          <w:sz w:val="18"/>
+          <w:szCs w:val="18"/>
+        </w:rPr>
+        <w:t xml:space="preserve">•   </w:t>
+      </w:r>
+      <w:r>
+        <w:rPr>
+          <w:sz w:val="18"/>
+          <w:szCs w:val="18"/>
+        </w:rPr>
+        <w:t xml:space="preserve">Commit strategy: service commits, or a request-scoped commit/rollback in the dependency - pick one, consistently.</w:t>
+      </w:r>
+    </w:p>
+    <w:p>
+      <w:pPr>
+        <w:ind w:left="260" w:hanging="0"/>
+        <w:spacing w:before="0" w:after="15" w:line="230" w:lineRule="auto"/>
+        <w:shd w:val="clear" w:color="auto" w:fill="F2F2F2"/>
+      </w:pPr>
+      <w:r>
+        <w:rPr>
+          <w:b/>
+          <w:sz w:val="17"/>
+          <w:szCs w:val="17"/>
+        </w:rPr>
+        <w:t xml:space="preserve">Example:  </w:t>
+      </w:r>
+      <w:r>
+        <w:rPr>
+          <w:rFonts w:ascii="Consolas" w:hAnsi="Consolas" w:cs="Consolas"/>
+          <w:color w:val="3B3B3B"/>
+          <w:sz w:val="17"/>
+          <w:szCs w:val="17"/>
+        </w:rPr>
+        <w:t xml:space="preserve">engine = create_engine(DB_URL, pool_size=10)</w:t>
+      </w:r>
+    </w:p>
+    <w:p>
+      <w:pPr>
+        <w:ind w:left="260" w:hanging="0"/>
+        <w:spacing w:before="0" w:after="15" w:line="230" w:lineRule="auto"/>
+        <w:shd w:val="clear" w:color="auto" w:fill="F2F2F2"/>
+      </w:pPr>
+      <w:r>
+        <w:rPr>
+          <w:rFonts w:ascii="Consolas" w:hAnsi="Consolas" w:cs="Consolas"/>
+          <w:color w:val="3B3B3B"/>
+          <w:sz w:val="17"/>
+          <w:szCs w:val="17"/>
+        </w:rPr>
+        <w:t xml:space="preserve">SessionLocal = sessionmaker(bind=engine)</w:t>
+      </w:r>
+    </w:p>
+    <w:p>
+      <w:pPr>
+        <w:ind w:left="260" w:hanging="0"/>
+        <w:spacing w:before="0" w:after="15" w:line="230" w:lineRule="auto"/>
+        <w:shd w:val="clear" w:color="auto" w:fill="F2F2F2"/>
+      </w:pPr>
+      <w:r>
+        <w:rPr>
+          <w:rFonts w:ascii="Consolas" w:hAnsi="Consolas" w:cs="Consolas"/>
+          <w:color w:val="3B3B3B"/>
+          <w:sz w:val="17"/>
+          <w:szCs w:val="17"/>
+        </w:rPr>
+        <w:t xml:space="preserve"/>
+      </w:r>
+    </w:p>
+    <w:p>
+      <w:pPr>
+        <w:ind w:left="260" w:hanging="0"/>
+        <w:spacing w:before="0" w:after="15" w:line="230" w:lineRule="auto"/>
+        <w:shd w:val="clear" w:color="auto" w:fill="F2F2F2"/>
+      </w:pPr>
+      <w:r>
+        <w:rPr>
+          <w:rFonts w:ascii="Consolas" w:hAnsi="Consolas" w:cs="Consolas"/>
+          <w:color w:val="3B3B3B"/>
+          <w:sz w:val="17"/>
+          <w:szCs w:val="17"/>
+        </w:rPr>
+        <w:t xml:space="preserve">def get_db():</w:t>
+      </w:r>
+    </w:p>
+    <w:p>
+      <w:pPr>
+        <w:ind w:left="260" w:hanging="0"/>
+        <w:spacing w:before="0" w:after="15" w:line="230" w:lineRule="auto"/>
+        <w:shd w:val="clear" w:color="auto" w:fill="F2F2F2"/>
+      </w:pPr>
+      <w:r>
+        <w:rPr>
+          <w:rFonts w:ascii="Consolas" w:hAnsi="Consolas" w:cs="Consolas"/>
+          <w:color w:val="3B3B3B"/>
+          <w:sz w:val="17"/>
+          <w:szCs w:val="17"/>
+        </w:rPr>
+        <w:t xml:space="preserve">    db = SessionLocal()</w:t>
+      </w:r>
+    </w:p>
+    <w:p>
+      <w:pPr>
+        <w:ind w:left="260" w:hanging="0"/>
+        <w:spacing w:before="0" w:after="15" w:line="230" w:lineRule="auto"/>
+        <w:shd w:val="clear" w:color="auto" w:fill="F2F2F2"/>
+      </w:pPr>
+      <w:r>
+        <w:rPr>
+          <w:rFonts w:ascii="Consolas" w:hAnsi="Consolas" w:cs="Consolas"/>
+          <w:color w:val="3B3B3B"/>
+          <w:sz w:val="17"/>
+          <w:szCs w:val="17"/>
+        </w:rPr>
+        <w:t xml:space="preserve">    try:</w:t>
+      </w:r>
+    </w:p>
+    <w:p>
+      <w:pPr>
+        <w:ind w:left="260" w:hanging="0"/>
+        <w:spacing w:before="0" w:after="15" w:line="230" w:lineRule="auto"/>
+        <w:shd w:val="clear" w:color="auto" w:fill="F2F2F2"/>
+      </w:pPr>
+      <w:r>
+        <w:rPr>
+          <w:rFonts w:ascii="Consolas" w:hAnsi="Consolas" w:cs="Consolas"/>
+          <w:color w:val="3B3B3B"/>
+          <w:sz w:val="17"/>
+          <w:szCs w:val="17"/>
+        </w:rPr>
+        <w:t xml:space="preserve">        yield db</w:t>
+      </w:r>
+    </w:p>
+    <w:p>
+      <w:pPr>
+        <w:ind w:left="260" w:hanging="0"/>
+        <w:spacing w:before="0" w:after="15" w:line="230" w:lineRule="auto"/>
+        <w:shd w:val="clear" w:color="auto" w:fill="F2F2F2"/>
+      </w:pPr>
+      <w:r>
+        <w:rPr>
+          <w:rFonts w:ascii="Consolas" w:hAnsi="Consolas" w:cs="Consolas"/>
+          <w:color w:val="3B3B3B"/>
+          <w:sz w:val="17"/>
+          <w:szCs w:val="17"/>
+        </w:rPr>
+        <w:t xml:space="preserve">        db.commit()</w:t>
+      </w:r>
+    </w:p>
+    <w:p>
+      <w:pPr>
+        <w:ind w:left="260" w:hanging="0"/>
+        <w:spacing w:before="0" w:after="15" w:line="230" w:lineRule="auto"/>
+        <w:shd w:val="clear" w:color="auto" w:fill="F2F2F2"/>
+      </w:pPr>
+      <w:r>
+        <w:rPr>
+          <w:rFonts w:ascii="Consolas" w:hAnsi="Consolas" w:cs="Consolas"/>
+          <w:color w:val="3B3B3B"/>
+          <w:sz w:val="17"/>
+          <w:szCs w:val="17"/>
+        </w:rPr>
+        <w:t xml:space="preserve">    except Exception:</w:t>
+      </w:r>
+    </w:p>
+    <w:p>
+      <w:pPr>
+        <w:ind w:left="260" w:hanging="0"/>
+        <w:spacing w:before="0" w:after="15" w:line="230" w:lineRule="auto"/>
+        <w:shd w:val="clear" w:color="auto" w:fill="F2F2F2"/>
+      </w:pPr>
+      <w:r>
+        <w:rPr>
+          <w:rFonts w:ascii="Consolas" w:hAnsi="Consolas" w:cs="Consolas"/>
+          <w:color w:val="3B3B3B"/>
+          <w:sz w:val="17"/>
+          <w:szCs w:val="17"/>
+        </w:rPr>
+        <w:t xml:space="preserve">        db.rollback(); raise</w:t>
+      </w:r>
+    </w:p>
+    <w:p>
+      <w:pPr>
+        <w:ind w:left="260" w:hanging="0"/>
+        <w:spacing w:before="0" w:after="15" w:line="230" w:lineRule="auto"/>
+        <w:shd w:val="clear" w:color="auto" w:fill="F2F2F2"/>
+      </w:pPr>
+      <w:r>
+        <w:rPr>
+          <w:rFonts w:ascii="Consolas" w:hAnsi="Consolas" w:cs="Consolas"/>
+          <w:color w:val="3B3B3B"/>
+          <w:sz w:val="17"/>
+          <w:szCs w:val="17"/>
+        </w:rPr>
+        <w:t xml:space="preserve">    finally:</w:t>
+      </w:r>
+    </w:p>
+    <w:p>
+      <w:pPr>
+        <w:ind w:left="260" w:hanging="0"/>
+        <w:spacing w:before="0" w:after="15" w:line="230" w:lineRule="auto"/>
+        <w:shd w:val="clear" w:color="auto" w:fill="F2F2F2"/>
+      </w:pPr>
+      <w:r>
+        <w:rPr>
+          <w:rFonts w:ascii="Consolas" w:hAnsi="Consolas" w:cs="Consolas"/>
+          <w:color w:val="3B3B3B"/>
+          <w:sz w:val="17"/>
+          <w:szCs w:val="17"/>
+        </w:rPr>
+        <w:t xml:space="preserve">        db.close()</w:t>
+      </w:r>
+    </w:p>
+    <w:p>
+      <w:pPr>
+        <w:ind w:left="120" w:hanging="0"/>
+        <w:spacing w:before="50" w:after="110" w:line="230" w:lineRule="auto"/>
+        <w:pBdr>
+          <w:left w:val="single" w:sz="12" w:space="4" w:color="2E5E1F"/>
+        </w:pBdr>
+      </w:pPr>
+      <w:r>
+        <w:rPr>
+          <w:b/>
+          <w:color w:val="2E5E1F"/>
+          <w:sz w:val="18"/>
+          <w:szCs w:val="18"/>
+        </w:rPr>
+        <w:t xml:space="preserve">Interview answer:  </w:t>
+      </w:r>
+      <w:r>
+        <w:rPr>
+          <w:i/>
+          <w:sz w:val="18"/>
+          <w:szCs w:val="18"/>
+        </w:rPr>
+        <w:t xml:space="preserve">FastAPI pairs with SQLAlchemy: an engine with a connection pool, a session factory, and a yield dependency giving each request a session that commits or rolls back and always closes. Alembic plays the migrations role. For full async I use create_async_engine with asyncpg and 2.0-style select - never a sync driver inside async def, which would block the loop.</w:t>
+      </w:r>
+    </w:p>
+    <w:p>
+      <w:pPr>
+        <w:spacing w:before="140" w:after="40" w:line="230" w:lineRule="auto"/>
+      </w:pPr>
+      <w:r>
+        <w:rPr>
+          <w:b/>
+          <w:sz w:val="21"/>
+          <w:szCs w:val="21"/>
+        </w:rPr>
+        <w:t xml:space="preserve">F2.5  BackgroundTasks vs Celery</w:t>
+      </w:r>
+    </w:p>
+    <w:p>
+      <w:pPr>
+        <w:spacing w:before="0" w:after="40" w:line="230" w:lineRule="auto"/>
+      </w:pPr>
+      <w:r>
+        <w:rPr>
+          <w:b/>
+          <w:sz w:val="18"/>
+          <w:szCs w:val="18"/>
+        </w:rPr>
+        <w:t xml:space="preserve">What it is:  </w:t>
+      </w:r>
+      <w:r>
+        <w:rPr>
+          <w:sz w:val="18"/>
+          <w:szCs w:val="18"/>
+        </w:rPr>
+        <w:t xml:space="preserve">BackgroundTasks runs work after the response in the same process - fine for small jobs; Celery remains the answer for real workloads.</w:t>
+      </w:r>
+    </w:p>
+    <w:p>
+      <w:pPr>
+        <w:ind w:left="260" w:hanging="200"/>
+        <w:spacing w:before="0" w:after="25" w:line="230" w:lineRule="auto"/>
+      </w:pPr>
+      <w:r>
+        <w:rPr>
+          <w:sz w:val="18"/>
+          <w:szCs w:val="18"/>
+        </w:rPr>
+        <w:t xml:space="preserve">•   </w:t>
+      </w:r>
+      <w:r>
+        <w:rPr>
+          <w:sz w:val="18"/>
+          <w:szCs w:val="18"/>
+        </w:rPr>
+        <w:t xml:space="preserve">background_tasks.add_task(fn, args) - response returns first, task runs after in the same worker.</w:t>
+      </w:r>
+    </w:p>
+    <w:p>
+      <w:pPr>
+        <w:ind w:left="260" w:hanging="200"/>
+        <w:spacing w:before="0" w:after="25" w:line="230" w:lineRule="auto"/>
+      </w:pPr>
+      <w:r>
+        <w:rPr>
+          <w:sz w:val="18"/>
+          <w:szCs w:val="18"/>
+        </w:rPr>
+        <w:t xml:space="preserve">•   </w:t>
+      </w:r>
+      <w:r>
+        <w:rPr>
+          <w:sz w:val="18"/>
+          <w:szCs w:val="18"/>
+        </w:rPr>
+        <w:t xml:space="preserve">Good for: fire-and-forget small work - notification email, audit log write, cache warm.</w:t>
+      </w:r>
+    </w:p>
+    <w:p>
+      <w:pPr>
+        <w:ind w:left="260" w:hanging="200"/>
+        <w:spacing w:before="0" w:after="25" w:line="230" w:lineRule="auto"/>
+      </w:pPr>
+      <w:r>
+        <w:rPr>
+          <w:sz w:val="18"/>
+          <w:szCs w:val="18"/>
+        </w:rPr>
+        <w:t xml:space="preserve">•   </w:t>
+      </w:r>
+      <w:r>
+        <w:rPr>
+          <w:sz w:val="18"/>
+          <w:szCs w:val="18"/>
+        </w:rPr>
+        <w:t xml:space="preserve">Limits: no retries, no persistence (process restart loses it), no separate scaling, shares the web worker's CPU/time.</w:t>
+      </w:r>
+    </w:p>
+    <w:p>
+      <w:pPr>
+        <w:ind w:left="260" w:hanging="200"/>
+        <w:spacing w:before="0" w:after="25" w:line="230" w:lineRule="auto"/>
+      </w:pPr>
+      <w:r>
+        <w:rPr>
+          <w:sz w:val="18"/>
+          <w:szCs w:val="18"/>
+        </w:rPr>
+        <w:t xml:space="preserve">•   </w:t>
+      </w:r>
+      <w:r>
+        <w:rPr>
+          <w:sz w:val="18"/>
+          <w:szCs w:val="18"/>
+        </w:rPr>
+        <w:t xml:space="preserve">Celery/RQ/arq when: retries and reliability matter, heavy jobs (PDFs, scraping, ML), scheduling, or dedicated worker scaling - same reasoning as the Django notes.</w:t>
+      </w:r>
+    </w:p>
+    <w:p>
+      <w:pPr>
+        <w:ind w:left="260" w:hanging="200"/>
+        <w:spacing w:before="0" w:after="25" w:line="230" w:lineRule="auto"/>
+      </w:pPr>
+      <w:r>
+        <w:rPr>
+          <w:sz w:val="18"/>
+          <w:szCs w:val="18"/>
+        </w:rPr>
+        <w:t xml:space="preserve">•   </w:t>
+      </w:r>
+      <w:r>
+        <w:rPr>
+          <w:sz w:val="18"/>
+          <w:szCs w:val="18"/>
+        </w:rPr>
+        <w:t xml:space="preserve">arq/dramatiq are async-native lighter alternatives in FastAPI projects.</w:t>
+      </w:r>
+    </w:p>
+    <w:p>
+      <w:pPr>
+        <w:ind w:left="260" w:hanging="200"/>
+        <w:spacing w:before="0" w:after="25" w:line="230" w:lineRule="auto"/>
+      </w:pPr>
+      <w:r>
+        <w:rPr>
+          <w:sz w:val="18"/>
+          <w:szCs w:val="18"/>
+        </w:rPr>
+        <w:t xml:space="preserve">•   </w:t>
+      </w:r>
+      <w:r>
+        <w:rPr>
+          <w:sz w:val="18"/>
+          <w:szCs w:val="18"/>
+        </w:rPr>
+        <w:t xml:space="preserve">Rule: would it hurt if this silently never ran? If yes - a real queue, not BackgroundTasks.</w:t>
+      </w:r>
+    </w:p>
+    <w:p>
+      <w:pPr>
+        <w:ind w:left="260" w:hanging="0"/>
+        <w:spacing w:before="0" w:after="15" w:line="230" w:lineRule="auto"/>
+        <w:shd w:val="clear" w:color="auto" w:fill="F2F2F2"/>
+      </w:pPr>
+      <w:r>
+        <w:rPr>
+          <w:b/>
+          <w:sz w:val="17"/>
+          <w:szCs w:val="17"/>
+        </w:rPr>
+        <w:t xml:space="preserve">Example:  </w:t>
+      </w:r>
+      <w:r>
+        <w:rPr>
+          <w:rFonts w:ascii="Consolas" w:hAnsi="Consolas" w:cs="Consolas"/>
+          <w:color w:val="3B3B3B"/>
+          <w:sz w:val="17"/>
+          <w:szCs w:val="17"/>
+        </w:rPr>
+        <w:t xml:space="preserve">@app.post("/orders")</w:t>
+      </w:r>
+    </w:p>
+    <w:p>
+      <w:pPr>
+        <w:ind w:left="260" w:hanging="0"/>
+        <w:spacing w:before="0" w:after="15" w:line="230" w:lineRule="auto"/>
+        <w:shd w:val="clear" w:color="auto" w:fill="F2F2F2"/>
+      </w:pPr>
+      <w:r>
+        <w:rPr>
+          <w:rFonts w:ascii="Consolas" w:hAnsi="Consolas" w:cs="Consolas"/>
+          <w:color w:val="3B3B3B"/>
+          <w:sz w:val="17"/>
+          <w:szCs w:val="17"/>
+        </w:rPr>
+        <w:t xml:space="preserve">async def create(order: OrderIn,</w:t>
+      </w:r>
+    </w:p>
+    <w:p>
+      <w:pPr>
+        <w:ind w:left="260" w:hanging="0"/>
+        <w:spacing w:before="0" w:after="15" w:line="230" w:lineRule="auto"/>
+        <w:shd w:val="clear" w:color="auto" w:fill="F2F2F2"/>
+      </w:pPr>
+      <w:r>
+        <w:rPr>
+          <w:rFonts w:ascii="Consolas" w:hAnsi="Consolas" w:cs="Consolas"/>
+          <w:color w:val="3B3B3B"/>
+          <w:sz w:val="17"/>
+          <w:szCs w:val="17"/>
+        </w:rPr>
+        <w:t xml:space="preserve">        bg: BackgroundTasks):</w:t>
+      </w:r>
+    </w:p>
+    <w:p>
+      <w:pPr>
+        <w:ind w:left="260" w:hanging="0"/>
+        <w:spacing w:before="0" w:after="15" w:line="230" w:lineRule="auto"/>
+        <w:shd w:val="clear" w:color="auto" w:fill="F2F2F2"/>
+      </w:pPr>
+      <w:r>
+        <w:rPr>
+          <w:rFonts w:ascii="Consolas" w:hAnsi="Consolas" w:cs="Consolas"/>
+          <w:color w:val="3B3B3B"/>
+          <w:sz w:val="17"/>
+          <w:szCs w:val="17"/>
+        </w:rPr>
+        <w:t xml:space="preserve">    saved = await save(order)</w:t>
+      </w:r>
+    </w:p>
+    <w:p>
+      <w:pPr>
+        <w:ind w:left="260" w:hanging="0"/>
+        <w:spacing w:before="0" w:after="15" w:line="230" w:lineRule="auto"/>
+        <w:shd w:val="clear" w:color="auto" w:fill="F2F2F2"/>
+      </w:pPr>
+      <w:r>
+        <w:rPr>
+          <w:rFonts w:ascii="Consolas" w:hAnsi="Consolas" w:cs="Consolas"/>
+          <w:color w:val="3B3B3B"/>
+          <w:sz w:val="17"/>
+          <w:szCs w:val="17"/>
+        </w:rPr>
+        <w:t xml:space="preserve">    bg.add_task(send_email, saved.id)</w:t>
+      </w:r>
+    </w:p>
+    <w:p>
+      <w:pPr>
+        <w:ind w:left="260" w:hanging="0"/>
+        <w:spacing w:before="0" w:after="15" w:line="230" w:lineRule="auto"/>
+        <w:shd w:val="clear" w:color="auto" w:fill="F2F2F2"/>
+      </w:pPr>
+      <w:r>
+        <w:rPr>
+          <w:rFonts w:ascii="Consolas" w:hAnsi="Consolas" w:cs="Consolas"/>
+          <w:color w:val="3B3B3B"/>
+          <w:sz w:val="17"/>
+          <w:szCs w:val="17"/>
+        </w:rPr>
+        <w:t xml:space="preserve">    return saved  # responds before email</w:t>
+      </w:r>
+    </w:p>
+    <w:p>
+      <w:pPr>
+        <w:ind w:left="120" w:hanging="0"/>
+        <w:spacing w:before="50" w:after="110" w:line="230" w:lineRule="auto"/>
+        <w:pBdr>
+          <w:left w:val="single" w:sz="12" w:space="4" w:color="2E5E1F"/>
+        </w:pBdr>
+      </w:pPr>
+      <w:r>
+        <w:rPr>
+          <w:b/>
+          <w:color w:val="2E5E1F"/>
+          <w:sz w:val="18"/>
+          <w:szCs w:val="18"/>
+        </w:rPr>
+        <w:t xml:space="preserve">Interview answer:  </w:t>
+      </w:r>
+      <w:r>
+        <w:rPr>
+          <w:i/>
+          <w:sz w:val="18"/>
+          <w:szCs w:val="18"/>
+        </w:rPr>
+        <w:t xml:space="preserve">BackgroundTasks defers small fire-and-forget work until after the response but lives in the same process - no retries, no persistence, no independent scaling. My rule: if it must not be lost, it goes to a real queue - Celery, or async-native arq - with the web process only enqueueing.</w:t>
+      </w:r>
+    </w:p>
+    <w:p>
+      <w:pPr>
+        <w:spacing w:before="140" w:after="40" w:line="230" w:lineRule="auto"/>
+      </w:pPr>
+      <w:r>
+        <w:rPr>
+          <w:b/>
+          <w:sz w:val="21"/>
+          <w:szCs w:val="21"/>
+        </w:rPr>
+        <w:t xml:space="preserve">F2.6  Testing - TestClient</w:t>
+      </w:r>
+    </w:p>
+    <w:p>
+      <w:pPr>
+        <w:spacing w:before="0" w:after="40" w:line="230" w:lineRule="auto"/>
+      </w:pPr>
+      <w:r>
+        <w:rPr>
+          <w:b/>
+          <w:sz w:val="18"/>
+          <w:szCs w:val="18"/>
+        </w:rPr>
+        <w:t xml:space="preserve">What it is:  </w:t>
+      </w:r>
+      <w:r>
+        <w:rPr>
+          <w:sz w:val="18"/>
+          <w:szCs w:val="18"/>
+        </w:rPr>
+        <w:t xml:space="preserve">TestClient calls the app in-process with the requests API; dependency_overrides swap real resources for fakes.</w:t>
+      </w:r>
+    </w:p>
+    <w:p>
+      <w:pPr>
+        <w:ind w:left="260" w:hanging="200"/>
+        <w:spacing w:before="0" w:after="25" w:line="230" w:lineRule="auto"/>
+      </w:pPr>
+      <w:r>
+        <w:rPr>
+          <w:sz w:val="18"/>
+          <w:szCs w:val="18"/>
+        </w:rPr>
+        <w:t xml:space="preserve">•   </w:t>
+      </w:r>
+      <w:r>
+        <w:rPr>
+          <w:sz w:val="18"/>
+          <w:szCs w:val="18"/>
+        </w:rPr>
+        <w:t xml:space="preserve">client = TestClient(app); client.post("/orders", json={...}) - no server needed, assert status_code and .json().</w:t>
+      </w:r>
+    </w:p>
+    <w:p>
+      <w:pPr>
+        <w:ind w:left="260" w:hanging="200"/>
+        <w:spacing w:before="0" w:after="25" w:line="230" w:lineRule="auto"/>
+      </w:pPr>
+      <w:r>
+        <w:rPr>
+          <w:sz w:val="18"/>
+          <w:szCs w:val="18"/>
+        </w:rPr>
+        <w:t xml:space="preserve">•   </w:t>
+      </w:r>
+      <w:r>
+        <w:rPr>
+          <w:sz w:val="18"/>
+          <w:szCs w:val="18"/>
+        </w:rPr>
+        <w:t xml:space="preserve">app.dependency_overrides[get_db] = test_db - tests run on SQLite/memory or a fixture DB; override get_current_user to fake auth without token dances.</w:t>
+      </w:r>
+    </w:p>
+    <w:p>
+      <w:pPr>
+        <w:ind w:left="260" w:hanging="200"/>
+        <w:spacing w:before="0" w:after="25" w:line="230" w:lineRule="auto"/>
+      </w:pPr>
+      <w:r>
+        <w:rPr>
+          <w:sz w:val="18"/>
+          <w:szCs w:val="18"/>
+        </w:rPr>
+        <w:t xml:space="preserve">•   </w:t>
+      </w:r>
+      <w:r>
+        <w:rPr>
+          <w:sz w:val="18"/>
+          <w:szCs w:val="18"/>
+        </w:rPr>
+        <w:t xml:space="preserve">pytest fixtures build client + DB per test/session; httpx.AsyncClient(app=...) tests async endpoints natively.</w:t>
+      </w:r>
+    </w:p>
+    <w:p>
+      <w:pPr>
+        <w:ind w:left="260" w:hanging="200"/>
+        <w:spacing w:before="0" w:after="25" w:line="230" w:lineRule="auto"/>
+      </w:pPr>
+      <w:r>
+        <w:rPr>
+          <w:sz w:val="18"/>
+          <w:szCs w:val="18"/>
+        </w:rPr>
+        <w:t xml:space="preserve">•   </w:t>
+      </w:r>
+      <w:r>
+        <w:rPr>
+          <w:sz w:val="18"/>
+          <w:szCs w:val="18"/>
+        </w:rPr>
+        <w:t xml:space="preserve">Validation is already tested by FastAPI - focus tests on business logic, permission matrix (401/403/404) and contract shapes.</w:t>
+      </w:r>
+    </w:p>
+    <w:p>
+      <w:pPr>
+        <w:ind w:left="260" w:hanging="200"/>
+        <w:spacing w:before="0" w:after="25" w:line="230" w:lineRule="auto"/>
+      </w:pPr>
+      <w:r>
+        <w:rPr>
+          <w:sz w:val="18"/>
+          <w:szCs w:val="18"/>
+        </w:rPr>
+        <w:t xml:space="preserve">•   </w:t>
+      </w:r>
+      <w:r>
+        <w:rPr>
+          <w:sz w:val="18"/>
+          <w:szCs w:val="18"/>
+        </w:rPr>
+        <w:t xml:space="preserve">The DI design is what makes this clean - no monkeypatching, just override the dependency graph.</w:t>
+      </w:r>
+    </w:p>
+    <w:p>
+      <w:pPr>
+        <w:ind w:left="260" w:hanging="200"/>
+        <w:spacing w:before="0" w:after="25" w:line="230" w:lineRule="auto"/>
+      </w:pPr>
+      <w:r>
+        <w:rPr>
+          <w:sz w:val="18"/>
+          <w:szCs w:val="18"/>
+        </w:rPr>
+        <w:t xml:space="preserve">•   </w:t>
+      </w:r>
+      <w:r>
+        <w:rPr>
+          <w:sz w:val="18"/>
+          <w:szCs w:val="18"/>
+        </w:rPr>
+        <w:t xml:space="preserve">schemathesis/property tests can fuzz endpoints straight from the OpenAPI schema - bonus point.</w:t>
+      </w:r>
+    </w:p>
+    <w:p>
+      <w:pPr>
+        <w:ind w:left="260" w:hanging="0"/>
+        <w:spacing w:before="0" w:after="15" w:line="230" w:lineRule="auto"/>
+        <w:shd w:val="clear" w:color="auto" w:fill="F2F2F2"/>
+      </w:pPr>
+      <w:r>
+        <w:rPr>
+          <w:b/>
+          <w:sz w:val="17"/>
+          <w:szCs w:val="17"/>
+        </w:rPr>
+        <w:t xml:space="preserve">Example:  </w:t>
+      </w:r>
+      <w:r>
+        <w:rPr>
+          <w:rFonts w:ascii="Consolas" w:hAnsi="Consolas" w:cs="Consolas"/>
+          <w:color w:val="3B3B3B"/>
+          <w:sz w:val="17"/>
+          <w:szCs w:val="17"/>
+        </w:rPr>
+        <w:t xml:space="preserve">def test_create_order(client):</w:t>
+      </w:r>
+    </w:p>
+    <w:p>
+      <w:pPr>
+        <w:ind w:left="260" w:hanging="0"/>
+        <w:spacing w:before="0" w:after="15" w:line="230" w:lineRule="auto"/>
+        <w:shd w:val="clear" w:color="auto" w:fill="F2F2F2"/>
+      </w:pPr>
+      <w:r>
+        <w:rPr>
+          <w:rFonts w:ascii="Consolas" w:hAnsi="Consolas" w:cs="Consolas"/>
+          <w:color w:val="3B3B3B"/>
+          <w:sz w:val="17"/>
+          <w:szCs w:val="17"/>
+        </w:rPr>
+        <w:t xml:space="preserve">    app.dependency_overrides[get_current_user] = \</w:t>
+      </w:r>
+    </w:p>
+    <w:p>
+      <w:pPr>
+        <w:ind w:left="260" w:hanging="0"/>
+        <w:spacing w:before="0" w:after="15" w:line="230" w:lineRule="auto"/>
+        <w:shd w:val="clear" w:color="auto" w:fill="F2F2F2"/>
+      </w:pPr>
+      <w:r>
+        <w:rPr>
+          <w:rFonts w:ascii="Consolas" w:hAnsi="Consolas" w:cs="Consolas"/>
+          <w:color w:val="3B3B3B"/>
+          <w:sz w:val="17"/>
+          <w:szCs w:val="17"/>
+        </w:rPr>
+        <w:t xml:space="preserve">        lambda: fake_user</w:t>
+      </w:r>
+    </w:p>
+    <w:p>
+      <w:pPr>
+        <w:ind w:left="260" w:hanging="0"/>
+        <w:spacing w:before="0" w:after="15" w:line="230" w:lineRule="auto"/>
+        <w:shd w:val="clear" w:color="auto" w:fill="F2F2F2"/>
+      </w:pPr>
+      <w:r>
+        <w:rPr>
+          <w:rFonts w:ascii="Consolas" w:hAnsi="Consolas" w:cs="Consolas"/>
+          <w:color w:val="3B3B3B"/>
+          <w:sz w:val="17"/>
+          <w:szCs w:val="17"/>
+        </w:rPr>
+        <w:t xml:space="preserve">    r = client.post("/api/v1/orders",</w:t>
+      </w:r>
+    </w:p>
+    <w:p>
+      <w:pPr>
+        <w:ind w:left="260" w:hanging="0"/>
+        <w:spacing w:before="0" w:after="15" w:line="230" w:lineRule="auto"/>
+        <w:shd w:val="clear" w:color="auto" w:fill="F2F2F2"/>
+      </w:pPr>
+      <w:r>
+        <w:rPr>
+          <w:rFonts w:ascii="Consolas" w:hAnsi="Consolas" w:cs="Consolas"/>
+          <w:color w:val="3B3B3B"/>
+          <w:sz w:val="17"/>
+          <w:szCs w:val="17"/>
+        </w:rPr>
+        <w:t xml:space="preserve">                    json={"amount": "99.5",</w:t>
+      </w:r>
+    </w:p>
+    <w:p>
+      <w:pPr>
+        <w:ind w:left="260" w:hanging="0"/>
+        <w:spacing w:before="0" w:after="15" w:line="230" w:lineRule="auto"/>
+        <w:shd w:val="clear" w:color="auto" w:fill="F2F2F2"/>
+      </w:pPr>
+      <w:r>
+        <w:rPr>
+          <w:rFonts w:ascii="Consolas" w:hAnsi="Consolas" w:cs="Consolas"/>
+          <w:color w:val="3B3B3B"/>
+          <w:sz w:val="17"/>
+          <w:szCs w:val="17"/>
+        </w:rPr>
+        <w:t xml:space="preserve">                          "items": [1]})</w:t>
+      </w:r>
+    </w:p>
+    <w:p>
+      <w:pPr>
+        <w:ind w:left="260" w:hanging="0"/>
+        <w:spacing w:before="0" w:after="15" w:line="230" w:lineRule="auto"/>
+        <w:shd w:val="clear" w:color="auto" w:fill="F2F2F2"/>
+      </w:pPr>
+      <w:r>
+        <w:rPr>
+          <w:rFonts w:ascii="Consolas" w:hAnsi="Consolas" w:cs="Consolas"/>
+          <w:color w:val="3B3B3B"/>
+          <w:sz w:val="17"/>
+          <w:szCs w:val="17"/>
+        </w:rPr>
+        <w:t xml:space="preserve">    assert r.status_code == 201</w:t>
+      </w:r>
+    </w:p>
+    <w:p>
+      <w:pPr>
+        <w:ind w:left="260" w:hanging="0"/>
+        <w:spacing w:before="0" w:after="15" w:line="230" w:lineRule="auto"/>
+        <w:shd w:val="clear" w:color="auto" w:fill="F2F2F2"/>
+      </w:pPr>
+      <w:r>
+        <w:rPr>
+          <w:rFonts w:ascii="Consolas" w:hAnsi="Consolas" w:cs="Consolas"/>
+          <w:color w:val="3B3B3B"/>
+          <w:sz w:val="17"/>
+          <w:szCs w:val="17"/>
+        </w:rPr>
+        <w:t xml:space="preserve">    assert r.json()["amount"] == "99.5"</w:t>
+      </w:r>
+    </w:p>
+    <w:p>
+      <w:pPr>
+        <w:ind w:left="120" w:hanging="0"/>
+        <w:spacing w:before="50" w:after="110" w:line="230" w:lineRule="auto"/>
+        <w:pBdr>
+          <w:left w:val="single" w:sz="12" w:space="4" w:color="2E5E1F"/>
+        </w:pBdr>
+      </w:pPr>
+      <w:r>
+        <w:rPr>
+          <w:b/>
+          <w:color w:val="2E5E1F"/>
+          <w:sz w:val="18"/>
+          <w:szCs w:val="18"/>
+        </w:rPr>
+        <w:t xml:space="preserve">Interview answer:  </w:t>
+      </w:r>
+      <w:r>
+        <w:rPr>
+          <w:i/>
+          <w:sz w:val="18"/>
+          <w:szCs w:val="18"/>
+        </w:rPr>
+        <w:t xml:space="preserve">TestClient exercises the app in-process with a requests-style API, and dependency_overrides is the superpower - swap the DB session or current user for fakes without monkeypatching. I cover the permission matrix and business logic, use AsyncClient for async endpoints, and let the OpenAPI schema drive fuzz tests when time allows.</w:t>
+      </w:r>
+    </w:p>
+    <w:p>
+      <w:pPr>
+        <w:spacing w:before="140" w:after="40" w:line="230" w:lineRule="auto"/>
+      </w:pPr>
+      <w:r>
+        <w:rPr>
+          <w:b/>
+          <w:sz w:val="21"/>
+          <w:szCs w:val="21"/>
+        </w:rPr>
+        <w:t xml:space="preserve">F2.7  Auto Docs and Deployment</w:t>
+      </w:r>
+    </w:p>
+    <w:p>
+      <w:pPr>
+        <w:spacing w:before="0" w:after="40" w:line="230" w:lineRule="auto"/>
+      </w:pPr>
+      <w:r>
+        <w:rPr>
+          <w:b/>
+          <w:sz w:val="18"/>
+          <w:szCs w:val="18"/>
+        </w:rPr>
+        <w:t xml:space="preserve">What it is:  </w:t>
+      </w:r>
+      <w:r>
+        <w:rPr>
+          <w:sz w:val="18"/>
+          <w:szCs w:val="18"/>
+        </w:rPr>
+        <w:t xml:space="preserve">OpenAPI docs generate themselves from the code; production runs uvicorn workers - usually under gunicorn - behind nginx.</w:t>
+      </w:r>
+    </w:p>
+    <w:p>
+      <w:pPr>
+        <w:ind w:left="260" w:hanging="200"/>
+        <w:spacing w:before="0" w:after="25" w:line="230" w:lineRule="auto"/>
+      </w:pPr>
+      <w:r>
+        <w:rPr>
+          <w:sz w:val="18"/>
+          <w:szCs w:val="18"/>
+        </w:rPr>
+        <w:t xml:space="preserve">•   </w:t>
+      </w:r>
+      <w:r>
+        <w:rPr>
+          <w:sz w:val="18"/>
+          <w:szCs w:val="18"/>
+        </w:rPr>
+        <w:t xml:space="preserve">/docs (Swagger UI) and /redoc render from the generated OpenAPI JSON - types, examples, auth button; always current because the code is the source.</w:t>
+      </w:r>
+    </w:p>
+    <w:p>
+      <w:pPr>
+        <w:ind w:left="260" w:hanging="200"/>
+        <w:spacing w:before="0" w:after="25" w:line="230" w:lineRule="auto"/>
+      </w:pPr>
+      <w:r>
+        <w:rPr>
+          <w:sz w:val="18"/>
+          <w:szCs w:val="18"/>
+        </w:rPr>
+        <w:t xml:space="preserve">•   </w:t>
+      </w:r>
+      <w:r>
+        <w:rPr>
+          <w:sz w:val="18"/>
+          <w:szCs w:val="18"/>
+        </w:rPr>
+        <w:t xml:space="preserve">Enrich docs with tags, summary/description, Field(examples=[...]), documented error responses; docs_url=None hides them on locked-down deployments.</w:t>
+      </w:r>
+    </w:p>
+    <w:p>
+      <w:pPr>
+        <w:ind w:left="260" w:hanging="200"/>
+        <w:spacing w:before="0" w:after="25" w:line="230" w:lineRule="auto"/>
+      </w:pPr>
+      <w:r>
+        <w:rPr>
+          <w:sz w:val="18"/>
+          <w:szCs w:val="18"/>
+        </w:rPr>
+        <w:t xml:space="preserve">•   </w:t>
+      </w:r>
+      <w:r>
+        <w:rPr>
+          <w:sz w:val="18"/>
+          <w:szCs w:val="18"/>
+        </w:rPr>
+        <w:t xml:space="preserve">The schema doubles as a contract: frontend teams generate typed clients from openapi.json.</w:t>
+      </w:r>
+    </w:p>
+    <w:p>
+      <w:pPr>
+        <w:ind w:left="260" w:hanging="200"/>
+        <w:spacing w:before="0" w:after="25" w:line="230" w:lineRule="auto"/>
+      </w:pPr>
+      <w:r>
+        <w:rPr>
+          <w:sz w:val="18"/>
+          <w:szCs w:val="18"/>
+        </w:rPr>
+        <w:t xml:space="preserve">•   </w:t>
+      </w:r>
+      <w:r>
+        <w:rPr>
+          <w:sz w:val="18"/>
+          <w:szCs w:val="18"/>
+        </w:rPr>
+        <w:t xml:space="preserve">Deploy: gunicorn -k uvicorn.workers.UvicornWorker -w 4 - gunicorn manages processes, each worker an async event loop. nginx/traefik in front for TLS and buffering; containerized in my projects (ECS/App Runner/k8s).</w:t>
+      </w:r>
+    </w:p>
+    <w:p>
+      <w:pPr>
+        <w:ind w:left="260" w:hanging="200"/>
+        <w:spacing w:before="0" w:after="25" w:line="230" w:lineRule="auto"/>
+      </w:pPr>
+      <w:r>
+        <w:rPr>
+          <w:sz w:val="18"/>
+          <w:szCs w:val="18"/>
+        </w:rPr>
+        <w:t xml:space="preserve">•   </w:t>
+      </w:r>
+      <w:r>
+        <w:rPr>
+          <w:sz w:val="18"/>
+          <w:szCs w:val="18"/>
+        </w:rPr>
+        <w:t xml:space="preserve">Worker count: CPU-bound formulas matter less - async workers multiply concurrency per process; measure.</w:t>
+      </w:r>
+    </w:p>
+    <w:p>
+      <w:pPr>
+        <w:ind w:left="260" w:hanging="200"/>
+        <w:spacing w:before="0" w:after="25" w:line="230" w:lineRule="auto"/>
+      </w:pPr>
+      <w:r>
+        <w:rPr>
+          <w:sz w:val="18"/>
+          <w:szCs w:val="18"/>
+        </w:rPr>
+        <w:t xml:space="preserve">•   </w:t>
+      </w:r>
+      <w:r>
+        <w:rPr>
+          <w:sz w:val="18"/>
+          <w:szCs w:val="18"/>
+        </w:rPr>
+        <w:t xml:space="preserve">Production checklist: settings from env, real CORS origins, structured logging with request IDs, /health endpoint, APM/Sentry.</w:t>
+      </w:r>
+    </w:p>
+    <w:p>
+      <w:pPr>
+        <w:ind w:left="260" w:hanging="0"/>
+        <w:spacing w:before="0" w:after="15" w:line="230" w:lineRule="auto"/>
+        <w:shd w:val="clear" w:color="auto" w:fill="F2F2F2"/>
+      </w:pPr>
+      <w:r>
+        <w:rPr>
+          <w:b/>
+          <w:sz w:val="17"/>
+          <w:szCs w:val="17"/>
+        </w:rPr>
+        <w:t xml:space="preserve">Example:  </w:t>
+      </w:r>
+      <w:r>
+        <w:rPr>
+          <w:rFonts w:ascii="Consolas" w:hAnsi="Consolas" w:cs="Consolas"/>
+          <w:color w:val="3B3B3B"/>
+          <w:sz w:val="17"/>
+          <w:szCs w:val="17"/>
+        </w:rPr>
+        <w:t xml:space="preserve">gunicorn app.main:app \</w:t>
+      </w:r>
+    </w:p>
+    <w:p>
+      <w:pPr>
+        <w:ind w:left="260" w:hanging="0"/>
+        <w:spacing w:before="0" w:after="15" w:line="230" w:lineRule="auto"/>
+        <w:shd w:val="clear" w:color="auto" w:fill="F2F2F2"/>
+      </w:pPr>
+      <w:r>
+        <w:rPr>
+          <w:rFonts w:ascii="Consolas" w:hAnsi="Consolas" w:cs="Consolas"/>
+          <w:color w:val="3B3B3B"/>
+          <w:sz w:val="17"/>
+          <w:szCs w:val="17"/>
+        </w:rPr>
+        <w:t xml:space="preserve">  -k uvicorn.workers.UvicornWorker \</w:t>
+      </w:r>
+    </w:p>
+    <w:p>
+      <w:pPr>
+        <w:ind w:left="260" w:hanging="0"/>
+        <w:spacing w:before="0" w:after="15" w:line="230" w:lineRule="auto"/>
+        <w:shd w:val="clear" w:color="auto" w:fill="F2F2F2"/>
+      </w:pPr>
+      <w:r>
+        <w:rPr>
+          <w:rFonts w:ascii="Consolas" w:hAnsi="Consolas" w:cs="Consolas"/>
+          <w:color w:val="3B3B3B"/>
+          <w:sz w:val="17"/>
+          <w:szCs w:val="17"/>
+        </w:rPr>
+        <w:t xml:space="preserve">  -w 4 --bind 0.0.0.0:8000</w:t>
+      </w:r>
+    </w:p>
+    <w:p>
+      <w:pPr>
+        <w:ind w:left="260" w:hanging="0"/>
+        <w:spacing w:before="0" w:after="15" w:line="230" w:lineRule="auto"/>
+        <w:shd w:val="clear" w:color="auto" w:fill="F2F2F2"/>
+      </w:pPr>
+      <w:r>
+        <w:rPr>
+          <w:rFonts w:ascii="Consolas" w:hAnsi="Consolas" w:cs="Consolas"/>
+          <w:color w:val="3B3B3B"/>
+          <w:sz w:val="17"/>
+          <w:szCs w:val="17"/>
+        </w:rPr>
+        <w:t xml:space="preserve"># docker: same line as CMD; nginx in front</w:t>
+      </w:r>
+    </w:p>
+    <w:p>
+      <w:pPr>
+        <w:ind w:left="120" w:hanging="0"/>
+        <w:spacing w:before="50" w:after="110" w:line="230" w:lineRule="auto"/>
+        <w:pBdr>
+          <w:left w:val="single" w:sz="12" w:space="4" w:color="2E5E1F"/>
+        </w:pBdr>
+      </w:pPr>
+      <w:r>
+        <w:rPr>
+          <w:b/>
+          <w:color w:val="2E5E1F"/>
+          <w:sz w:val="18"/>
+          <w:szCs w:val="18"/>
+        </w:rPr>
+        <w:t xml:space="preserve">Interview answer:  </w:t>
+      </w:r>
+      <w:r>
+        <w:rPr>
+          <w:i/>
+          <w:sz w:val="18"/>
+          <w:szCs w:val="18"/>
+        </w:rPr>
+        <w:t xml:space="preserve">FastAPI generates Swagger and ReDoc from the code's types - always in sync, enrichable with tags and examples, and the OpenAPI JSON doubles as a client-generation contract. Production runs gunicorn managing uvicorn workers behind nginx, containerized with env-driven settings, health checks and monitoring - in my case on AWS ECS and App Runner.</w:t>
       </w:r>
     </w:p>
     <w:sectPr>

</xml_diff>